<commit_message>
InB PaaS deployment diagram
</commit_message>
<xml_diff>
--- a/AZ-305-DesigningMicrosoftAzureInfrastructureSolutions/Compute Solution Summary.docx
+++ b/AZ-305-DesigningMicrosoftAzureInfrastructureSolutions/Compute Solution Summary.docx
@@ -489,7 +489,7 @@
     <w:p>
       <w:r>
         <w:pict w14:anchorId="2FF3253E">
-          <v:rect id="_x0000_i1037" style="width:0;height:1.5pt" o:hralign="center" o:hrstd="t" o:hr="t" fillcolor="#a0a0a0" stroked="f"/>
+          <v:rect id="_x0000_i1025" style="width:0;height:1.5pt" o:hralign="center" o:hrstd="t" o:hr="t" fillcolor="#a0a0a0" stroked="f"/>
         </w:pict>
       </w:r>
     </w:p>
@@ -825,7 +825,7 @@
     <w:p>
       <w:r>
         <w:pict w14:anchorId="1DE87DC3">
-          <v:rect id="_x0000_i1038" style="width:0;height:1.5pt" o:hralign="center" o:hrstd="t" o:hr="t" fillcolor="#a0a0a0" stroked="f"/>
+          <v:rect id="_x0000_i1026" style="width:0;height:1.5pt" o:hralign="center" o:hrstd="t" o:hr="t" fillcolor="#a0a0a0" stroked="f"/>
         </w:pict>
       </w:r>
     </w:p>
@@ -2166,6 +2166,7 @@
   <w:style w:type="character" w:default="1" w:styleId="DefaultParagraphFont">
     <w:name w:val="Default Paragraph Font"/>
     <w:uiPriority w:val="1"/>
+    <w:semiHidden/>
     <w:unhideWhenUsed/>
   </w:style>
   <w:style w:type="table" w:default="1" w:styleId="TableNormal">

</xml_diff>